<commit_message>
Added new feature for previous winners history (new page, new analytics, new workspace file) (#9)
</commit_message>
<xml_diff>
--- a/ExampleWorkspace/Templates/Analyse_Template.docx
+++ b/ExampleWorkspace/Templates/Analyse_Template.docx
@@ -123,7 +123,15 @@
               <w:t xml:space="preserve">Aktiv: </w:t>
             </w:r>
             <w:r>
-              <w:t>%AnzahlAktivePersonen%</w:t>
+              <w:t>%</w:t>
+            </w:r>
+            <w:proofErr w:type="spellStart"/>
+            <w:r>
+              <w:t>AnzahlAktivePersonen</w:t>
+            </w:r>
+            <w:proofErr w:type="spellEnd"/>
+            <w:r>
+              <w:t>%</w:t>
             </w:r>
           </w:p>
         </w:tc>
@@ -136,7 +144,15 @@
               <w:t xml:space="preserve">Gültig: </w:t>
             </w:r>
             <w:r>
-              <w:t>%AnzahlGültigeStarts%</w:t>
+              <w:t>%</w:t>
+            </w:r>
+            <w:proofErr w:type="spellStart"/>
+            <w:r>
+              <w:t>AnzahlGültigeStarts</w:t>
+            </w:r>
+            <w:proofErr w:type="spellEnd"/>
+            <w:r>
+              <w:t>%</w:t>
             </w:r>
           </w:p>
         </w:tc>
@@ -151,7 +167,15 @@
               <w:t xml:space="preserve">Inaktiv: </w:t>
             </w:r>
             <w:r>
-              <w:t>%AnzahlInaktivePersonen%</w:t>
+              <w:t>%</w:t>
+            </w:r>
+            <w:proofErr w:type="spellStart"/>
+            <w:r>
+              <w:t>AnzahlInaktivePersonen</w:t>
+            </w:r>
+            <w:proofErr w:type="spellEnd"/>
+            <w:r>
+              <w:t>%</w:t>
             </w:r>
           </w:p>
         </w:tc>
@@ -164,7 +188,15 @@
               <w:t xml:space="preserve">Inaktiv: </w:t>
             </w:r>
             <w:r>
-              <w:t>%AnzahlInaktiveStarts%</w:t>
+              <w:t>%</w:t>
+            </w:r>
+            <w:proofErr w:type="spellStart"/>
+            <w:r>
+              <w:t>AnzahlInaktiveStarts</w:t>
+            </w:r>
+            <w:proofErr w:type="spellEnd"/>
+            <w:r>
+              <w:t>%</w:t>
             </w:r>
           </w:p>
         </w:tc>
@@ -185,7 +217,15 @@
               <w:t xml:space="preserve">Wettkampf fehlt: </w:t>
             </w:r>
             <w:r>
-              <w:t>%AnzahlStartsFehlenderWettkampf%</w:t>
+              <w:t>%</w:t>
+            </w:r>
+            <w:proofErr w:type="spellStart"/>
+            <w:r>
+              <w:t>AnzahlStartsFehlenderWettkampf</w:t>
+            </w:r>
+            <w:proofErr w:type="spellEnd"/>
+            <w:r>
+              <w:t>%</w:t>
             </w:r>
           </w:p>
         </w:tc>
@@ -200,7 +240,15 @@
               <w:t xml:space="preserve">Gesamt: </w:t>
             </w:r>
             <w:r>
-              <w:t>%AnzahlPersonen%</w:t>
+              <w:t>%</w:t>
+            </w:r>
+            <w:proofErr w:type="spellStart"/>
+            <w:r>
+              <w:t>AnzahlPersonen</w:t>
+            </w:r>
+            <w:proofErr w:type="spellEnd"/>
+            <w:r>
+              <w:t>%</w:t>
             </w:r>
           </w:p>
         </w:tc>
@@ -213,7 +261,15 @@
               <w:t xml:space="preserve">Gesamt: </w:t>
             </w:r>
             <w:r>
-              <w:t>%AnzahlStarts%</w:t>
+              <w:t>%</w:t>
+            </w:r>
+            <w:proofErr w:type="spellStart"/>
+            <w:r>
+              <w:t>AnzahlStarts</w:t>
+            </w:r>
+            <w:proofErr w:type="spellEnd"/>
+            <w:r>
+              <w:t>%</w:t>
             </w:r>
           </w:p>
         </w:tc>
@@ -319,15 +375,19 @@
             <w:r>
               <w:t>%</w:t>
             </w:r>
+            <w:proofErr w:type="spellStart"/>
             <w:r>
               <w:t>AnzahlMännlich</w:t>
             </w:r>
+            <w:proofErr w:type="spellEnd"/>
             <w:r>
               <w:t>% (%</w:t>
             </w:r>
+            <w:proofErr w:type="spellStart"/>
             <w:r>
               <w:t>ProzentMännlich</w:t>
             </w:r>
+            <w:proofErr w:type="spellEnd"/>
             <w:r>
               <w:t>%</w:t>
             </w:r>
@@ -345,13 +405,29 @@
           </w:tcPr>
           <w:p>
             <w:r>
-              <w:t>%AnzahlStartsMännlich%</w:t>
+              <w:t>%</w:t>
+            </w:r>
+            <w:proofErr w:type="spellStart"/>
+            <w:r>
+              <w:t>AnzahlStartsMännlich</w:t>
+            </w:r>
+            <w:proofErr w:type="spellEnd"/>
+            <w:r>
+              <w:t>%</w:t>
             </w:r>
             <w:r>
               <w:t xml:space="preserve"> (</w:t>
             </w:r>
             <w:r>
-              <w:t>%ProzentStartsMännlich%</w:t>
+              <w:t>%</w:t>
+            </w:r>
+            <w:proofErr w:type="spellStart"/>
+            <w:r>
+              <w:t>ProzentStartsMännlich</w:t>
+            </w:r>
+            <w:proofErr w:type="spellEnd"/>
+            <w:r>
+              <w:t>%</w:t>
             </w:r>
             <w:r>
               <w:t xml:space="preserve"> %</w:t>
@@ -382,15 +458,19 @@
             <w:r>
               <w:t>%</w:t>
             </w:r>
+            <w:proofErr w:type="spellStart"/>
             <w:r>
               <w:t>AnzahlWeiblich</w:t>
             </w:r>
+            <w:proofErr w:type="spellEnd"/>
             <w:r>
               <w:t>% (%</w:t>
             </w:r>
+            <w:proofErr w:type="spellStart"/>
             <w:r>
               <w:t>ProzentWeiblich</w:t>
             </w:r>
+            <w:proofErr w:type="spellEnd"/>
             <w:r>
               <w:t>%</w:t>
             </w:r>
@@ -408,13 +488,29 @@
           </w:tcPr>
           <w:p>
             <w:r>
-              <w:t>%AnzahlStartsWeiblich%</w:t>
+              <w:t>%</w:t>
+            </w:r>
+            <w:proofErr w:type="spellStart"/>
+            <w:r>
+              <w:t>AnzahlStartsWeiblich</w:t>
+            </w:r>
+            <w:proofErr w:type="spellEnd"/>
+            <w:r>
+              <w:t>%</w:t>
             </w:r>
             <w:r>
               <w:t xml:space="preserve"> (</w:t>
             </w:r>
             <w:r>
-              <w:t>%ProzentStartsWeiblich%</w:t>
+              <w:t>%</w:t>
+            </w:r>
+            <w:proofErr w:type="spellStart"/>
+            <w:r>
+              <w:t>ProzentStartsWeiblich</w:t>
+            </w:r>
+            <w:proofErr w:type="spellEnd"/>
+            <w:r>
+              <w:t>%</w:t>
             </w:r>
             <w:r>
               <w:t xml:space="preserve"> %</w:t>
@@ -492,7 +588,21 @@
         <w:rPr>
           <w:rFonts w:ascii="Consolas" w:hAnsi="Consolas"/>
         </w:rPr>
-        <w:t>%StartsProPerson%</w:t>
+        <w:t>%</w:t>
+      </w:r>
+      <w:proofErr w:type="spellStart"/>
+      <w:r>
+        <w:rPr>
+          <w:rFonts w:ascii="Consolas" w:hAnsi="Consolas"/>
+        </w:rPr>
+        <w:t>StartsProPerson</w:t>
+      </w:r>
+      <w:proofErr w:type="spellEnd"/>
+      <w:r>
+        <w:rPr>
+          <w:rFonts w:ascii="Consolas" w:hAnsi="Consolas"/>
+        </w:rPr>
+        <w:t>%</w:t>
       </w:r>
     </w:p>
     <w:p>
@@ -526,7 +636,21 @@
         <w:rPr>
           <w:rFonts w:ascii="Consolas" w:hAnsi="Consolas"/>
         </w:rPr>
-        <w:t>%StartsProLage%</w:t>
+        <w:t>%</w:t>
+      </w:r>
+      <w:proofErr w:type="spellStart"/>
+      <w:r>
+        <w:rPr>
+          <w:rFonts w:ascii="Consolas" w:hAnsi="Consolas"/>
+        </w:rPr>
+        <w:t>StartsProLage</w:t>
+      </w:r>
+      <w:proofErr w:type="spellEnd"/>
+      <w:r>
+        <w:rPr>
+          <w:rFonts w:ascii="Consolas" w:hAnsi="Consolas"/>
+        </w:rPr>
+        <w:t>%</w:t>
       </w:r>
     </w:p>
     <w:p>
@@ -576,12 +700,14 @@
         </w:rPr>
         <w:t>%</w:t>
       </w:r>
+      <w:proofErr w:type="spellStart"/>
       <w:r>
         <w:rPr>
           <w:rFonts w:ascii="Consolas" w:hAnsi="Consolas"/>
         </w:rPr>
         <w:t>StartDistanzen</w:t>
       </w:r>
+      <w:proofErr w:type="spellEnd"/>
       <w:r>
         <w:rPr>
           <w:rFonts w:ascii="Consolas" w:hAnsi="Consolas"/>
@@ -627,7 +753,21 @@
         <w:rPr>
           <w:rFonts w:ascii="Consolas" w:hAnsi="Consolas"/>
         </w:rPr>
-        <w:t>%PlätzeAltersverteilung%</w:t>
+        <w:t>%</w:t>
+      </w:r>
+      <w:proofErr w:type="spellStart"/>
+      <w:r>
+        <w:rPr>
+          <w:rFonts w:ascii="Consolas" w:hAnsi="Consolas"/>
+        </w:rPr>
+        <w:t>PlätzeAltersverteilung</w:t>
+      </w:r>
+      <w:proofErr w:type="spellEnd"/>
+      <w:r>
+        <w:rPr>
+          <w:rFonts w:ascii="Consolas" w:hAnsi="Consolas"/>
+        </w:rPr>
+        <w:t>%</w:t>
       </w:r>
     </w:p>
     <w:p>
@@ -675,7 +815,21 @@
         <w:rPr>
           <w:rFonts w:ascii="Consolas" w:hAnsi="Consolas"/>
         </w:rPr>
-        <w:t>%AlterJeRennen%</w:t>
+        <w:t>%</w:t>
+      </w:r>
+      <w:proofErr w:type="spellStart"/>
+      <w:r>
+        <w:rPr>
+          <w:rFonts w:ascii="Consolas" w:hAnsi="Consolas"/>
+        </w:rPr>
+        <w:t>AlterJeRennen</w:t>
+      </w:r>
+      <w:proofErr w:type="spellEnd"/>
+      <w:r>
+        <w:rPr>
+          <w:rFonts w:ascii="Consolas" w:hAnsi="Consolas"/>
+        </w:rPr>
+        <w:t>%</w:t>
       </w:r>
     </w:p>
     <w:p>
@@ -709,7 +863,208 @@
         <w:rPr>
           <w:rFonts w:ascii="Consolas" w:hAnsi="Consolas"/>
         </w:rPr>
-        <w:t>%AbständeZwischenStarts%</w:t>
+        <w:t>%</w:t>
+      </w:r>
+      <w:proofErr w:type="spellStart"/>
+      <w:r>
+        <w:rPr>
+          <w:rFonts w:ascii="Consolas" w:hAnsi="Consolas"/>
+        </w:rPr>
+        <w:t>AbständeZwischenStarts</w:t>
+      </w:r>
+      <w:proofErr w:type="spellEnd"/>
+      <w:r>
+        <w:rPr>
+          <w:rFonts w:ascii="Consolas" w:hAnsi="Consolas"/>
+        </w:rPr>
+        <w:t>%</w:t>
+      </w:r>
+    </w:p>
+    <w:p>
+      <w:pPr>
+        <w:pStyle w:val="Listenabsatz"/>
+        <w:numPr>
+          <w:ilvl w:val="0"/>
+          <w:numId w:val="1"/>
+        </w:numPr>
+        <w:ind w:left="0"/>
+        <w:rPr>
+          <w:b/>
+          <w:bCs/>
+        </w:rPr>
+      </w:pPr>
+      <w:r>
+        <w:rPr>
+          <w:b/>
+          <w:bCs/>
+        </w:rPr>
+        <w:t>Anzahl Podiumsplätze einer Person (egal ob Gold, Silber oder Bronze):</w:t>
+      </w:r>
+    </w:p>
+    <w:p>
+      <w:pPr>
+        <w:rPr>
+          <w:rFonts w:ascii="Consolas" w:hAnsi="Consolas"/>
+        </w:rPr>
+      </w:pPr>
+      <w:r>
+        <w:rPr>
+          <w:rFonts w:ascii="Consolas" w:hAnsi="Consolas"/>
+        </w:rPr>
+        <w:t>%</w:t>
+      </w:r>
+      <w:proofErr w:type="spellStart"/>
+      <w:r>
+        <w:rPr>
+          <w:rFonts w:ascii="Consolas" w:hAnsi="Consolas"/>
+        </w:rPr>
+        <w:t>AnzahlPodiumsPlätze%</w:t>
+      </w:r>
+      <w:proofErr w:type="spellEnd"/>
+    </w:p>
+    <w:p>
+      <w:pPr>
+        <w:pStyle w:val="Listenabsatz"/>
+        <w:numPr>
+          <w:ilvl w:val="0"/>
+          <w:numId w:val="1"/>
+        </w:numPr>
+        <w:ind w:left="0"/>
+        <w:rPr>
+          <w:b/>
+          <w:bCs/>
+        </w:rPr>
+      </w:pPr>
+      <w:r>
+        <w:rPr>
+          <w:b/>
+          <w:bCs/>
+        </w:rPr>
+        <w:lastRenderedPageBreak/>
+        <w:t>Anzahl Podiumsplätze einer Person (Gold):</w:t>
+      </w:r>
+    </w:p>
+    <w:p>
+      <w:pPr>
+        <w:rPr>
+          <w:rFonts w:ascii="Consolas" w:hAnsi="Consolas"/>
+        </w:rPr>
+      </w:pPr>
+      <w:r>
+        <w:rPr>
+          <w:rFonts w:ascii="Consolas" w:hAnsi="Consolas"/>
+        </w:rPr>
+        <w:t>%</w:t>
+      </w:r>
+      <w:proofErr w:type="spellStart"/>
+      <w:r>
+        <w:rPr>
+          <w:rFonts w:ascii="Consolas" w:hAnsi="Consolas"/>
+        </w:rPr>
+        <w:t>AnzahlPodiumsPlätze_Gold</w:t>
+      </w:r>
+      <w:proofErr w:type="spellEnd"/>
+      <w:r>
+        <w:rPr>
+          <w:rFonts w:ascii="Consolas" w:hAnsi="Consolas"/>
+        </w:rPr>
+        <w:t>%</w:t>
+      </w:r>
+    </w:p>
+    <w:p>
+      <w:pPr>
+        <w:pStyle w:val="Listenabsatz"/>
+        <w:numPr>
+          <w:ilvl w:val="0"/>
+          <w:numId w:val="1"/>
+        </w:numPr>
+        <w:ind w:left="0"/>
+        <w:rPr>
+          <w:b/>
+          <w:bCs/>
+        </w:rPr>
+      </w:pPr>
+      <w:r>
+        <w:rPr>
+          <w:b/>
+          <w:bCs/>
+        </w:rPr>
+        <w:t>Anzahl Podiumsplätze einer Person (Silber):</w:t>
+      </w:r>
+    </w:p>
+    <w:p>
+      <w:pPr>
+        <w:rPr>
+          <w:rFonts w:ascii="Consolas" w:hAnsi="Consolas"/>
+        </w:rPr>
+      </w:pPr>
+      <w:r>
+        <w:rPr>
+          <w:rFonts w:ascii="Consolas" w:hAnsi="Consolas"/>
+        </w:rPr>
+        <w:t>%</w:t>
+      </w:r>
+      <w:proofErr w:type="spellStart"/>
+      <w:r>
+        <w:rPr>
+          <w:rFonts w:ascii="Consolas" w:hAnsi="Consolas"/>
+        </w:rPr>
+        <w:t>AnzahlPodiumsPlätze_Silber</w:t>
+      </w:r>
+      <w:proofErr w:type="spellEnd"/>
+      <w:r>
+        <w:rPr>
+          <w:rFonts w:ascii="Consolas" w:hAnsi="Consolas"/>
+        </w:rPr>
+        <w:t>%</w:t>
+      </w:r>
+    </w:p>
+    <w:p>
+      <w:pPr>
+        <w:pStyle w:val="Listenabsatz"/>
+        <w:numPr>
+          <w:ilvl w:val="0"/>
+          <w:numId w:val="1"/>
+        </w:numPr>
+        <w:ind w:left="0"/>
+        <w:rPr>
+          <w:b/>
+          <w:bCs/>
+        </w:rPr>
+      </w:pPr>
+      <w:r>
+        <w:rPr>
+          <w:b/>
+          <w:bCs/>
+        </w:rPr>
+        <w:t>Anzahl Podiumsplätze einer Person (Bronze):</w:t>
+      </w:r>
+    </w:p>
+    <w:p>
+      <w:pPr>
+        <w:rPr>
+          <w:rFonts w:ascii="Consolas" w:hAnsi="Consolas"/>
+        </w:rPr>
+      </w:pPr>
+      <w:r>
+        <w:rPr>
+          <w:rFonts w:ascii="Consolas" w:hAnsi="Consolas"/>
+        </w:rPr>
+        <w:t>%</w:t>
+      </w:r>
+      <w:proofErr w:type="spellStart"/>
+      <w:r>
+        <w:rPr>
+          <w:rFonts w:ascii="Consolas" w:hAnsi="Consolas"/>
+        </w:rPr>
+        <w:t>AnzahlPodiumsPlätze_Bronze</w:t>
+      </w:r>
+      <w:proofErr w:type="spellEnd"/>
+      <w:r>
+        <w:rPr>
+          <w:rFonts w:ascii="Consolas" w:hAnsi="Consolas"/>
+        </w:rPr>
+        <w:t>%</w:t>
       </w:r>
     </w:p>
     <w:sectPr>
@@ -769,8 +1124,13 @@
     <w:pPr>
       <w:pStyle w:val="Fuzeile"/>
     </w:pPr>
+    <w:proofErr w:type="spellStart"/>
     <w:r>
-      <w:t>AppVersion: %Version%</w:t>
+      <w:t>AppVersion</w:t>
+    </w:r>
+    <w:proofErr w:type="spellEnd"/>
+    <w:r>
+      <w:t>: %Version%</w:t>
     </w:r>
   </w:p>
   <w:p>
@@ -854,7 +1214,7 @@
   <w:abstractNum w:abstractNumId="0" w15:restartNumberingAfterBreak="0">
     <w:nsid w:val="144254F5"/>
     <w:multiLevelType w:val="hybridMultilevel"/>
-    <w:tmpl w:val="61D8FDCA"/>
+    <w:tmpl w:val="0FE06C44"/>
     <w:lvl w:ilvl="0" w:tplc="0407000B">
       <w:start w:val="1"/>
       <w:numFmt w:val="bullet"/>
@@ -1573,6 +1933,7 @@
   <w:style w:type="character" w:default="1" w:styleId="Absatz-Standardschriftart">
     <w:name w:val="Default Paragraph Font"/>
     <w:uiPriority w:val="1"/>
+    <w:semiHidden/>
     <w:unhideWhenUsed/>
   </w:style>
   <w:style w:type="table" w:default="1" w:styleId="NormaleTabelle">

</xml_diff>